<commit_message>
Add Handbook_criteria.docx; update Build Plan and Decision Log for the Geopolitics republish
Add Handbook_criteria.docx (the AAOCC/content-weight config the demo scripts load, previously missing from the repo). Update Build_Plan.docx and Decision_Log.docx: Geopolitics was found republished on the live site independently of this project's Claude sessions (docs/handbook/ lists all 4 original pages again, commit dated ~2026-10-19/20); Decision Log status for this item changed from OPEN to PARTIALLY RESOLVED (Geopolitics); Trust & AI Safety still OPEN.
</commit_message>
<xml_diff>
--- a/Decision_Log.docx
+++ b/Decision_Log.docx
@@ -1730,7 +1730,7 @@
                 <w:sz w:val="19"/>
                 <w:szCs w:val="19"/>
               </w:rPr>
-              <w:t xml:space="preserve">The zip's own docs/handbook/index.md says "List generated 2026-10-19" and lists exactly 3 pages, none of them Geopolitics — consistent with publish_wiki.py's documented behaviour of dropping a page that is no longer marked APPROVED on its most recent run, not with a stale file. Suspected cause: Geopolitics's wiki-page frontmatter no longer reads status: APPROVED. Fix requires Kyran's explicit go-ahead before anything is pushed to the shared repo again.</w:t>
+              <w:t xml:space="preserve">The zip's own docs/handbook/index.md says "List generated 2026-10-19" and lists exactly 3 pages, none of them Geopolitics — consistent with publish_wiki.py's documented behaviour of dropping a page that is no longer marked APPROVED on its most recent run, not with a stale file. Suspected cause: Geopolitics's wiki-page frontmatter no longer reads status: APPROVED. Fix requires Kyran's explicit go-ahead before anything is pushed to the shared repo again. Update (2026-10-21): checked the live repo directly — docs/handbook/ now lists all 4 original pages again, including Geopolitics (commit “Publish handbook page 1: Geopolitics...”, dated roughly 2026-10-19/20), so its APPROVED status was restored and it was republished, independently of this project's own Claude sessions (cause not confirmed). Trust &amp; AI Safety is still not in docs/handbook/ at all — that part remains open and still needs a team decision (publish it, or confirm the “assess AI suppliers” substitution with the tutor) before anything else is pushed.</w:t>
             </w:r>
           </w:p>
         </w:tc>
@@ -1750,11 +1750,11 @@
                 <w:rFonts w:ascii="Calibri" w:cs="Calibri" w:eastAsia="Calibri" w:hAnsi="Calibri"/>
                 <w:b/>
                 <w:bCs/>
-                <w:color w:val="C00000"/>
-                <w:sz w:val="19"/>
-                <w:szCs w:val="19"/>
-              </w:rPr>
-              <w:t xml:space="preserve">OPEN</w:t>
+                <w:color w:val="7F6000"/>
+                <w:sz w:val="19"/>
+                <w:szCs w:val="19"/>
+              </w:rPr>
+              <w:t xml:space="preserve">PARTIALLY RESOLVED (Geopolitics); Trust &amp; AI Safety still OPEN</w:t>
             </w:r>
           </w:p>
         </w:tc>

</xml_diff>